<commit_message>
Add team details and GitHub link to documents
</commit_message>
<xml_diff>
--- a/Project Templates - Completed/4. Project Planning Phase/Project Planning Template.docx
+++ b/Project Templates - Completed/4. Project Planning Phase/Project Planning Template.docx
@@ -184,7 +184,7 @@
               </w:rPr>
             </w:pPr>
             <w:r>
-              <w:t>[Your Team ID]</w:t>
+              <w:t>SWTID-2026-6519</w:t>
             </w:r>
           </w:p>
         </w:tc>
@@ -708,7 +708,7 @@
               </w:rPr>
             </w:pPr>
             <w:r>
-              <w:t>[Your Name]</w:t>
+              <w:t>Suhas V</w:t>
             </w:r>
           </w:p>
         </w:tc>
@@ -856,7 +856,7 @@
               </w:rPr>
             </w:pPr>
             <w:r>
-              <w:t>[Your Name]</w:t>
+              <w:t>Sureshbabu M</w:t>
             </w:r>
           </w:p>
         </w:tc>
@@ -1004,7 +1004,7 @@
               </w:rPr>
             </w:pPr>
             <w:r>
-              <w:t>[Your Name]</w:t>
+              <w:t>Vignesh Kumar S</w:t>
             </w:r>
           </w:p>
         </w:tc>
@@ -1154,7 +1154,7 @@
               </w:rPr>
             </w:pPr>
             <w:r>
-              <w:t>[Your Name]</w:t>
+              <w:t>Anuja P</w:t>
             </w:r>
           </w:p>
         </w:tc>
@@ -1302,7 +1302,7 @@
               </w:rPr>
             </w:pPr>
             <w:r>
-              <w:t>[Your Name]</w:t>
+              <w:t>Archana S</w:t>
             </w:r>
           </w:p>
         </w:tc>
@@ -1450,7 +1450,7 @@
               </w:rPr>
             </w:pPr>
             <w:r>
-              <w:t>[Your Name]</w:t>
+              <w:t>Suhas V</w:t>
             </w:r>
           </w:p>
         </w:tc>
@@ -1600,7 +1600,7 @@
               </w:rPr>
             </w:pPr>
             <w:r>
-              <w:t>[Your Name]</w:t>
+              <w:t>Sureshbabu M</w:t>
             </w:r>
           </w:p>
         </w:tc>
@@ -1748,7 +1748,7 @@
               </w:rPr>
             </w:pPr>
             <w:r>
-              <w:t>[Your Name]</w:t>
+              <w:t>Vignesh Kumar S</w:t>
             </w:r>
           </w:p>
         </w:tc>
@@ -1896,7 +1896,7 @@
               </w:rPr>
             </w:pPr>
             <w:r>
-              <w:t>[Your Name]</w:t>
+              <w:t>Anuja P</w:t>
             </w:r>
           </w:p>
         </w:tc>
@@ -2044,7 +2044,7 @@
               </w:rPr>
             </w:pPr>
             <w:r>
-              <w:t>[Your Name]</w:t>
+              <w:t>Archana S</w:t>
             </w:r>
           </w:p>
         </w:tc>
@@ -2194,7 +2194,7 @@
               </w:rPr>
             </w:pPr>
             <w:r>
-              <w:t>[Your Name]</w:t>
+              <w:t>Suhas V</w:t>
             </w:r>
           </w:p>
         </w:tc>
@@ -2342,7 +2342,7 @@
               </w:rPr>
             </w:pPr>
             <w:r>
-              <w:t>[Your Name]</w:t>
+              <w:t>Sureshbabu M</w:t>
             </w:r>
           </w:p>
         </w:tc>
@@ -2490,7 +2490,7 @@
               </w:rPr>
             </w:pPr>
             <w:r>
-              <w:t>[Your Name]</w:t>
+              <w:t>Vignesh Kumar S</w:t>
             </w:r>
           </w:p>
         </w:tc>
@@ -2638,7 +2638,7 @@
               </w:rPr>
             </w:pPr>
             <w:r>
-              <w:t>[Your Name]</w:t>
+              <w:t>Anuja P</w:t>
             </w:r>
           </w:p>
         </w:tc>
@@ -2788,7 +2788,7 @@
               </w:rPr>
             </w:pPr>
             <w:r>
-              <w:t>[Your Name]</w:t>
+              <w:t>Archana S</w:t>
             </w:r>
           </w:p>
         </w:tc>
@@ -2936,7 +2936,7 @@
               </w:rPr>
             </w:pPr>
             <w:r>
-              <w:t>[Your Name]</w:t>
+              <w:t>Suhas V</w:t>
             </w:r>
           </w:p>
         </w:tc>
@@ -3084,7 +3084,7 @@
               </w:rPr>
             </w:pPr>
             <w:r>
-              <w:t>[Your Name]</w:t>
+              <w:t>Sureshbabu M</w:t>
             </w:r>
           </w:p>
         </w:tc>
@@ -3232,7 +3232,7 @@
               </w:rPr>
             </w:pPr>
             <w:r>
-              <w:t>[Your Name]</w:t>
+              <w:t>Vignesh Kumar S</w:t>
             </w:r>
           </w:p>
         </w:tc>
@@ -3380,7 +3380,7 @@
               </w:rPr>
             </w:pPr>
             <w:r>
-              <w:t>[Your Name]</w:t>
+              <w:t>Anuja P</w:t>
             </w:r>
           </w:p>
         </w:tc>

</xml_diff>